<commit_message>
Update instructions for Operators assignment
</commit_message>
<xml_diff>
--- a/cs10/python/s09_operators.docx
+++ b/cs10/python/s09_operators.docx
@@ -1833,7 +1833,53 @@
         </w:tc>
       </w:tr>
     </w:tbl>
-    <w:p/>
+    <w:p>
+      <w:pPr>
+        <w:pStyle w:val="Question1"/>
+      </w:pPr>
+      <w:r>
+        <w:t>4</w:t>
+      </w:r>
+      <w:r>
+        <w:t>.</w:t>
+      </w:r>
+      <w:r>
+        <w:tab/>
+      </w:r>
+      <w:r>
+        <w:t xml:space="preserve">Use the file </w:t>
+      </w:r>
+      <w:r>
+        <w:rPr>
+          <w:rFonts w:ascii="Courier New" w:hAnsi="Courier New" w:cs="Courier New"/>
+          <w:b/>
+        </w:rPr>
+        <w:t>s0</w:t>
+      </w:r>
+      <w:r>
+        <w:rPr>
+          <w:rFonts w:ascii="Courier New" w:hAnsi="Courier New" w:cs="Courier New"/>
+          <w:b/>
+        </w:rPr>
+        <w:t>9</w:t>
+      </w:r>
+      <w:r>
+        <w:rPr>
+          <w:rFonts w:ascii="Courier New" w:hAnsi="Courier New" w:cs="Courier New"/>
+          <w:b/>
+        </w:rPr>
+        <w:t>_test.py</w:t>
+      </w:r>
+      <w:r>
+        <w:t xml:space="preserve"> to check your answers to </w:t>
+      </w:r>
+      <w:r>
+        <w:t>all questions</w:t>
+      </w:r>
+      <w:r>
+        <w:t>.</w:t>
+      </w:r>
+    </w:p>
     <w:sectPr>
       <w:footerReference w:type="default" r:id="rId7"/>
       <w:footerReference w:type="first" r:id="rId8"/>

</xml_diff>